<commit_message>
feat(v8.0): 124-test master verification suite, dynamic problem decomposition, evidence streams, statistical feasibility, and section cross-checks
</commit_message>
<xml_diff>
--- a/tests/fixtures/cardiovascular_sglt2/PROPOSAL.docx
+++ b/tests/fixtures/cardiovascular_sglt2/PROPOSAL.docx
@@ -11586,7 +11586,7 @@
           <w:szCs w:val="23"/>
           <w:bCs/>
         </w:rPr>
-        <w:t>۱۳-۷. تعیین روایی ابزار گردآوری</w:t>
+        <w:t>۱۳-۷. تعیین اعتبار ابزار گردآوری</w:t>
       </w:r>
     </w:p>
     <w:p>
@@ -11625,7 +11625,7 @@
           <w:szCs w:val="23"/>
           <w:bCs/>
         </w:rPr>
-        <w:t>۱۳-۸. تعیین پایایی ابزار گردآوری</w:t>
+        <w:t>۱۳-۸. تعیین پایایی / قابلیت اعتماد ابزار در صورت نیاز</w:t>
       </w:r>
     </w:p>
     <w:p>
@@ -11726,7 +11726,7 @@
           <w:szCs w:val="23"/>
           <w:bCs/>
         </w:rPr>
-        <w:t>۱۳-۱۰. روش تجزیه و تحلیل داده‌ها</w:t>
+        <w:t>۱۳-۱۰. روش تجزیه و تحلیل داده</w:t>
       </w:r>
     </w:p>
     <w:p>
@@ -12105,7 +12105,7 @@
           <w:szCs w:val="23"/>
           <w:bCs/>
         </w:rPr>
-        <w:t>۱۳-۱۲. نحوه رعایت نکات امنیتی و حفاظت پروژه</w:t>
+        <w:t>۱۳-۱۲. نحوه رعایت نکات امنیتی و حفاظت پروژه در صورت نیاز</w:t>
       </w:r>
     </w:p>
     <w:p>
@@ -12206,7 +12206,7 @@
           <w:szCs w:val="23"/>
           <w:bCs/>
         </w:rPr>
-        <w:t>۱۳-۱۴. شیوه اجرایی مراحل طرح</w:t>
+        <w:t>۱۳-۱۴. روش انجام طرح، شیوه اجرایی مراحل طرح و چگونگی جمع‌آوری اطلاعات</w:t>
       </w:r>
     </w:p>
     <w:p>

</xml_diff>